<commit_message>
[FIX] - Finalize reflection part of Phase 2
</commit_message>
<xml_diff>
--- a/reflection_phase_I&IIupdated.docx
+++ b/reflection_phase_I&IIupdated.docx
@@ -3657,25 +3657,7 @@
           <w:kern w:val="0"/>
           <w14:ligatures w14:val="none"/>
         </w:rPr>
-        <w:t xml:space="preserve"> instead of stopping instantly. Second, if the engine temperature exceeds the overheat threshold, the ECU limits RPM </w:t>
-      </w:r>
-      <w:proofErr w:type="gramStart"/>
-      <w:r>
-        <w:rPr>
-          <w:rFonts w:ascii="Times New Roman" w:eastAsia="Times New Roman" w:hAnsi="Times New Roman" w:cs="Times New Roman"/>
-          <w:kern w:val="0"/>
-          <w14:ligatures w14:val="none"/>
-        </w:rPr>
-        <w:t>and also</w:t>
-      </w:r>
-      <w:proofErr w:type="gramEnd"/>
-      <w:r>
-        <w:rPr>
-          <w:rFonts w:ascii="Times New Roman" w:eastAsia="Times New Roman" w:hAnsi="Times New Roman" w:cs="Times New Roman"/>
-          <w:kern w:val="0"/>
-          <w14:ligatures w14:val="none"/>
-        </w:rPr>
-        <w:t xml:space="preserve"> caps speed to reduce performance. Third, if the fuel level drops below the low-fuel threshold, the ECU limits maximum speed. Fourth, if the engine is on and speed is </w:t>
+        <w:t xml:space="preserve"> instead of stopping instantly. Second, if the engine temperature exceeds the overheat threshold, the ECU limits RPM and also caps speed to reduce performance. Third, if the fuel level drops below the low-fuel threshold, the ECU limits maximum speed. Fourth, if the engine is on and speed is </w:t>
       </w:r>
       <w:r>
         <w:rPr>
@@ -3727,6 +3709,7 @@
           <w:bCs/>
         </w:rPr>
       </w:pPr>
+      <w:bookmarkStart w:id="1" w:name="OLE_LINK2"/>
       <w:r>
         <w:rPr>
           <w:rFonts w:hAnsi="Symbol"/>
@@ -3758,7 +3741,11 @@
         <w:br/>
         <w:t>Synchronization made the dashboard more consistent and stable. Instead of showing mixed values from different update moments, the dashboard now reads a protected snapshot of the system state. This prevents partial updates such as a new RPM being displayed with an old speed or fuel value. It also made the output look smoother and more realistic because subsystem values changed in a controlled way. Overall, synchronization improved both correctness and the visual quality of the dashboard.</w:t>
       </w:r>
-    </w:p>
+      <w:r>
+        <w:t xml:space="preserve"> However, the GUI aspect of the dashboard remained the same as in the Phase I.</w:t>
+      </w:r>
+    </w:p>
+    <w:bookmarkEnd w:id="1"/>
     <w:p>
       <w:pPr>
         <w:spacing w:line="480" w:lineRule="auto"/>

</xml_diff>